<commit_message>
Update gitignore and cleanup
</commit_message>
<xml_diff>
--- a/outputs/resume_backend_software_engineer_nexus_systems_1.docx
+++ b/outputs/resume_backend_software_engineer_nexus_systems_1.docx
@@ -45,24 +45,24 @@
         <w:spacing w:before="240" w:after="80"/>
       </w:pPr>
       <w:r>
-        <w:t xml:space="preserve">SUMMARY</w:t>
-      </w:r>
-    </w:p>
-    <w:p>
-      <w:pPr>
-        <w:spacing w:after="80"/>
-      </w:pPr>
-    </w:p>
-    <w:p>
-      <w:pPr>
-        <w:spacing w:after="60"/>
-      </w:pPr>
-      <w:r>
-        <w:rPr>
-          <w:sz w:val="22"/>
-          <w:szCs w:val="22"/>
-        </w:rPr>
-        <w:t xml:space="preserve">Highly motivated Computer Science graduate with hands-on experience designing and building scalable APIs and microservices for high-performance systems. Eager to contribute as a Backend Software Engineer at Nexus Systems, leveraging expertise in Python, FastAPI, and cloud platforms to deliver reliable enterprise SaaS solutions.</w:t>
+        <w:t xml:space="preserve">PROFESSIONAL SUMMARY</w:t>
+      </w:r>
+    </w:p>
+    <w:p>
+      <w:pPr>
+        <w:spacing w:after="80"/>
+      </w:pPr>
+    </w:p>
+    <w:p>
+      <w:pPr>
+        <w:spacing w:after="60"/>
+      </w:pPr>
+      <w:r>
+        <w:rPr>
+          <w:sz w:val="22"/>
+          <w:szCs w:val="22"/>
+        </w:rPr>
+        <w:t xml:space="preserve">Highly motivated Backend Software Engineer graduating from UC Berkeley, seeking to design and build scalable APIs and microservices for an enterprise SaaS platform. Proven ability to deliver reliable, high-performance systems using Python, FastAPI, and AWS, with strong skills in cloud deployment and cross-functional collaboration.</w:t>
       </w:r>
     </w:p>
     <w:p>
@@ -96,55 +96,55 @@
           <w:sz w:val="22"/>
           <w:szCs w:val="22"/>
         </w:rPr>
-        <w:t xml:space="preserve">Languages: Python, JavaScript, SQL, TypeScript, Java, Bash</w:t>
-      </w:r>
-    </w:p>
-    <w:p>
-      <w:pPr>
-        <w:spacing w:after="60"/>
-      </w:pPr>
-      <w:r>
-        <w:rPr>
-          <w:sz w:val="22"/>
-          <w:szCs w:val="22"/>
-        </w:rPr>
-        <w:t xml:space="preserve">Backend Frameworks: FastAPI, Node.js (Express), Django</w:t>
-      </w:r>
-    </w:p>
-    <w:p>
-      <w:pPr>
-        <w:spacing w:after="60"/>
-      </w:pPr>
-      <w:r>
-        <w:rPr>
-          <w:sz w:val="22"/>
-          <w:szCs w:val="22"/>
-        </w:rPr>
-        <w:t xml:space="preserve">Databases: PostgreSQL, MySQL, MongoDB, Redis</w:t>
-      </w:r>
-    </w:p>
-    <w:p>
-      <w:pPr>
-        <w:spacing w:after="60"/>
-      </w:pPr>
-      <w:r>
-        <w:rPr>
-          <w:sz w:val="22"/>
-          <w:szCs w:val="22"/>
-        </w:rPr>
-        <w:t xml:space="preserve">Cloud &amp; DevOps: AWS (EC2, S3, Lambda), Docker, GitHub Actions, CI/CD, Terraform (basic)</w:t>
-      </w:r>
-    </w:p>
-    <w:p>
-      <w:pPr>
-        <w:spacing w:after="60"/>
-      </w:pPr>
-      <w:r>
-        <w:rPr>
-          <w:sz w:val="22"/>
-          <w:szCs w:val="22"/>
-        </w:rPr>
-        <w:t xml:space="preserve">Tools: Git, Linux, VS Code, Jira</w:t>
+        <w:t xml:space="preserve">Backend &amp; Cloud: Python, FastAPI, Node.js/Express, AWS (EC2, S3, Lambda), Docker, Terraform (beginner), Git, GitHub Actions, Microservices, RESTful APIs, System Design, CI/CD</w:t>
+      </w:r>
+    </w:p>
+    <w:p>
+      <w:pPr>
+        <w:spacing w:after="60"/>
+      </w:pPr>
+      <w:r>
+        <w:rPr>
+          <w:sz w:val="22"/>
+          <w:szCs w:val="22"/>
+        </w:rPr>
+        <w:t xml:space="preserve">Databases: PostgreSQL, MySQL, MongoDB, Redis, SQL</w:t>
+      </w:r>
+    </w:p>
+    <w:p>
+      <w:pPr>
+        <w:spacing w:after="60"/>
+      </w:pPr>
+      <w:r>
+        <w:rPr>
+          <w:sz w:val="22"/>
+          <w:szCs w:val="22"/>
+        </w:rPr>
+        <w:t xml:space="preserve">Languages: JavaScript, TypeScript, Java, Bash</w:t>
+      </w:r>
+    </w:p>
+    <w:p>
+      <w:pPr>
+        <w:spacing w:after="60"/>
+      </w:pPr>
+      <w:r>
+        <w:rPr>
+          <w:sz w:val="22"/>
+          <w:szCs w:val="22"/>
+        </w:rPr>
+        <w:t xml:space="preserve">Testing &amp; Tools: pytest, Jest, Jira, Linux, VS Code</w:t>
+      </w:r>
+    </w:p>
+    <w:p>
+      <w:pPr>
+        <w:spacing w:after="60"/>
+      </w:pPr>
+      <w:r>
+        <w:rPr>
+          <w:sz w:val="22"/>
+          <w:szCs w:val="22"/>
+        </w:rPr>
+        <w:t xml:space="preserve">Other: React, PyTorch, scikit-learn, pandas, NumPy</w:t>
       </w:r>
     </w:p>
     <w:p>
@@ -195,55 +195,50 @@
     </w:p>
     <w:p>
       <w:pPr>
-        <w:spacing w:after="80"/>
-      </w:pPr>
-    </w:p>
-    <w:p>
-      <w:pPr>
-        <w:spacing w:after="60"/>
-      </w:pPr>
-      <w:r>
-        <w:rPr>
-          <w:sz w:val="22"/>
-          <w:szCs w:val="22"/>
-        </w:rPr>
-        <w:t xml:space="preserve">*   Designed and built a scalable FastAPI microservice for ingesting and normalizing customer data from multiple third-party APIs, reducing manual processing time by 60% and enhancing data reliability for enterprise clients.</w:t>
-      </w:r>
-    </w:p>
-    <w:p>
-      <w:pPr>
-        <w:spacing w:after="60"/>
-      </w:pPr>
-      <w:r>
-        <w:rPr>
-          <w:sz w:val="22"/>
-          <w:szCs w:val="22"/>
-        </w:rPr>
-        <w:t xml:space="preserve">*   Collaborated with frontend teams to implement WebSocket-driven real-time data updates for critical dashboard components, ensuring high-performance user experiences.</w:t>
-      </w:r>
-    </w:p>
-    <w:p>
-      <w:pPr>
-        <w:spacing w:after="60"/>
-      </w:pPr>
-      <w:r>
-        <w:rPr>
-          <w:sz w:val="22"/>
-          <w:szCs w:val="22"/>
-        </w:rPr>
-        <w:t xml:space="preserve">*   Ensured system reliability and maintainability by developing comprehensive unit and integration tests, achieving 85% code coverage.</w:t>
-      </w:r>
-    </w:p>
-    <w:p>
-      <w:pPr>
-        <w:spacing w:after="60"/>
-      </w:pPr>
-      <w:r>
-        <w:rPr>
-          <w:sz w:val="22"/>
-          <w:szCs w:val="22"/>
-        </w:rPr>
-        <w:t xml:space="preserve">*   Actively participated in agile sprints and daily standups within a cross-functional team of 8, contributing to efficient project delivery.</w:t>
+        <w:spacing w:after="60"/>
+      </w:pPr>
+      <w:r>
+        <w:rPr>
+          <w:sz w:val="22"/>
+          <w:szCs w:val="22"/>
+        </w:rPr>
+        <w:t xml:space="preserve">* Designed and built a scalable FastAPI microservice to ingest and normalize customer data from 3 third-party APIs, directly supporting core data operations for an enterprise platform, resulting in a 60% reduction in manual processing time.</w:t>
+      </w:r>
+    </w:p>
+    <w:p>
+      <w:pPr>
+        <w:spacing w:after="60"/>
+      </w:pPr>
+      <w:r>
+        <w:rPr>
+          <w:sz w:val="22"/>
+          <w:szCs w:val="22"/>
+        </w:rPr>
+        <w:t xml:space="preserve">* Collaborated closely with frontend teams to develop real-time React dashboard components using WebSockets, ensuring seamless data visualization for users.</w:t>
+      </w:r>
+    </w:p>
+    <w:p>
+      <w:pPr>
+        <w:spacing w:after="60"/>
+      </w:pPr>
+      <w:r>
+        <w:rPr>
+          <w:sz w:val="22"/>
+          <w:szCs w:val="22"/>
+        </w:rPr>
+        <w:t xml:space="preserve">* Ensured system reliability and performance by writing comprehensive unit and integration tests, achieving 85% code coverage with pytest and Jest.</w:t>
+      </w:r>
+    </w:p>
+    <w:p>
+      <w:pPr>
+        <w:spacing w:after="60"/>
+      </w:pPr>
+      <w:r>
+        <w:rPr>
+          <w:sz w:val="22"/>
+          <w:szCs w:val="22"/>
+        </w:rPr>
+        <w:t xml:space="preserve">* Actively participated in agile development sprints and daily standups within an 8-person cross-functional team, utilizing Jira to drive project delivery.</w:t>
       </w:r>
     </w:p>
     <w:p>
@@ -277,43 +272,38 @@
     </w:p>
     <w:p>
       <w:pPr>
-        <w:spacing w:after="80"/>
-      </w:pPr>
-    </w:p>
-    <w:p>
-      <w:pPr>
-        <w:spacing w:after="60"/>
-      </w:pPr>
-      <w:r>
-        <w:rPr>
-          <w:sz w:val="22"/>
-          <w:szCs w:val="22"/>
-        </w:rPr>
-        <w:t xml:space="preserve">*   Automated data preprocessing pipelines using Python (pandas, spaCy), significantly reducing data preparation time from 6 hours to under 30 minutes, enhancing operational efficiency.</w:t>
-      </w:r>
-    </w:p>
-    <w:p>
-      <w:pPr>
-        <w:spacing w:after="60"/>
-      </w:pPr>
-      <w:r>
-        <w:rPr>
-          <w:sz w:val="22"/>
-          <w:szCs w:val="22"/>
-        </w:rPr>
-        <w:t xml:space="preserve">*   Contributed to data pipeline automation for large datasets (50K samples), improving efficiency and data reliability.</w:t>
-      </w:r>
-    </w:p>
-    <w:p>
-      <w:pPr>
-        <w:spacing w:after="60"/>
-      </w:pPr>
-      <w:r>
-        <w:rPr>
-          <w:sz w:val="22"/>
-          <w:szCs w:val="22"/>
-        </w:rPr>
-        <w:t xml:space="preserve">*   Presented technical findings and collaborated on documentation with a team of 15 researchers, demonstrating strong communication skills.</w:t>
+        <w:spacing w:after="60"/>
+      </w:pPr>
+      <w:r>
+        <w:rPr>
+          <w:sz w:val="22"/>
+          <w:szCs w:val="22"/>
+        </w:rPr>
+        <w:t xml:space="preserve">* Engineered and fine-tuned a BERT-based text classification model on a custom dataset of 50K labeled samples, achieving 91% accuracy, demonstrating strong problem-solving and analytical skills applicable to complex system design.</w:t>
+      </w:r>
+    </w:p>
+    <w:p>
+      <w:pPr>
+        <w:spacing w:after="60"/>
+      </w:pPr>
+      <w:r>
+        <w:rPr>
+          <w:sz w:val="22"/>
+          <w:szCs w:val="22"/>
+        </w:rPr>
+        <w:t xml:space="preserve">* Developed an automated data preprocessing pipeline using pandas and spaCy, significantly improving efficiency by reducing preparation time from 6 hours to under 30 minutes.</w:t>
+      </w:r>
+    </w:p>
+    <w:p>
+      <w:pPr>
+        <w:spacing w:after="60"/>
+      </w:pPr>
+      <w:r>
+        <w:rPr>
+          <w:sz w:val="22"/>
+          <w:szCs w:val="22"/>
+        </w:rPr>
+        <w:t xml:space="preserve">* Contributed to a paper draft and presented findings to a group of 15 researchers.</w:t>
       </w:r>
     </w:p>
     <w:p>
@@ -352,43 +342,38 @@
     </w:p>
     <w:p>
       <w:pPr>
-        <w:spacing w:after="80"/>
-      </w:pPr>
-    </w:p>
-    <w:p>
-      <w:pPr>
-        <w:spacing w:after="60"/>
-      </w:pPr>
-      <w:r>
-        <w:rPr>
-          <w:sz w:val="22"/>
-          <w:szCs w:val="22"/>
-        </w:rPr>
-        <w:t xml:space="preserve">*   Designed and implemented the backend for a full-stack job application tracker, leveraging Node.js/Express and PostgreSQL to support a scalable application.</w:t>
-      </w:r>
-    </w:p>
-    <w:p>
-      <w:pPr>
-        <w:spacing w:after="60"/>
-      </w:pPr>
-      <w:r>
-        <w:rPr>
-          <w:sz w:val="22"/>
-          <w:szCs w:val="22"/>
-        </w:rPr>
-        <w:t xml:space="preserve">*   Engineered secure APIs with JWT-based authentication and role-based access control, ensuring data integrity and user authorization for a robust platform.</w:t>
-      </w:r>
-    </w:p>
-    <w:p>
-      <w:pPr>
-        <w:spacing w:after="60"/>
-      </w:pPr>
-      <w:r>
-        <w:rPr>
-          <w:sz w:val="22"/>
-          <w:szCs w:val="22"/>
-        </w:rPr>
-        <w:t xml:space="preserve">*   Deployed the application on AWS EC2 with Nginx, establishing CI/CD pipelines via GitHub Actions for automated, reliable deployments.</w:t>
+        <w:spacing w:after="60"/>
+      </w:pPr>
+      <w:r>
+        <w:rPr>
+          <w:sz w:val="22"/>
+          <w:szCs w:val="22"/>
+        </w:rPr>
+        <w:t xml:space="preserve">* Designed and implemented a full-stack job application tracker, leveraging Node.js/Express as the backend for scalable APIs and PostgreSQL for robust data management.</w:t>
+      </w:r>
+    </w:p>
+    <w:p>
+      <w:pPr>
+        <w:spacing w:after="60"/>
+      </w:pPr>
+      <w:r>
+        <w:rPr>
+          <w:sz w:val="22"/>
+          <w:szCs w:val="22"/>
+        </w:rPr>
+        <w:t xml:space="preserve">* Integrated secure JWT-based authentication and role-based access control to ensure system reliability and data integrity.</w:t>
+      </w:r>
+    </w:p>
+    <w:p>
+      <w:pPr>
+        <w:spacing w:after="60"/>
+      </w:pPr>
+      <w:r>
+        <w:rPr>
+          <w:sz w:val="22"/>
+          <w:szCs w:val="22"/>
+        </w:rPr>
+        <w:t xml:space="preserve">* Orchestrated high-performance system deployment on AWS EC2 with Nginx, implementing automated CI/CD via GitHub Actions for continuous delivery.</w:t>
       </w:r>
     </w:p>
     <w:p>
@@ -410,31 +395,38 @@
     </w:p>
     <w:p>
       <w:pPr>
-        <w:spacing w:after="80"/>
-      </w:pPr>
-    </w:p>
-    <w:p>
-      <w:pPr>
-        <w:spacing w:after="60"/>
-      </w:pPr>
-      <w:r>
-        <w:rPr>
-          <w:sz w:val="22"/>
-          <w:szCs w:val="22"/>
-        </w:rPr>
-        <w:t xml:space="preserve">*   Engineered a scalable API endpoint using FastAPI, containerized with Docker, to expose real-time model inference, demonstrating practical microservice deployment.</w:t>
-      </w:r>
-    </w:p>
-    <w:p>
-      <w:pPr>
-        <w:spacing w:after="60"/>
-      </w:pPr>
-      <w:r>
-        <w:rPr>
-          <w:sz w:val="22"/>
-          <w:szCs w:val="22"/>
-        </w:rPr>
-        <w:t xml:space="preserve">*   Developed and trained a sentiment analysis model using PyTorch, showcasing proficiency in handling large datasets and complex algorithms.</w:t>
+        <w:spacing w:after="60"/>
+      </w:pPr>
+      <w:r>
+        <w:rPr>
+          <w:sz w:val="22"/>
+          <w:szCs w:val="22"/>
+        </w:rPr>
+        <w:t xml:space="preserve">* Developed and trained a sentiment analysis model on 100K product reviews, showcasing data processing and model deployment skills.</w:t>
+      </w:r>
+    </w:p>
+    <w:p>
+      <w:pPr>
+        <w:spacing w:after="60"/>
+      </w:pPr>
+      <w:r>
+        <w:rPr>
+          <w:sz w:val="22"/>
+          <w:szCs w:val="22"/>
+        </w:rPr>
+        <w:t xml:space="preserve">* Engineered a scalable FastAPI endpoint to expose model inference, utilizing Docker for efficient containerization and deployment.</w:t>
+      </w:r>
+    </w:p>
+    <w:p>
+      <w:pPr>
+        <w:spacing w:after="60"/>
+      </w:pPr>
+      <w:r>
+        <w:rPr>
+          <w:sz w:val="22"/>
+          <w:szCs w:val="22"/>
+        </w:rPr>
+        <w:t xml:space="preserve">* Achieved F1-score of 0.89 on the held-out test set.</w:t>
       </w:r>
     </w:p>
     <w:p>
@@ -482,11 +474,6 @@
         </w:rPr>
         <w:t xml:space="preserve">Graduated May 2024  |  GPA: 3.7 / 4.0  |  Dean's List (4 semesters)</w:t>
       </w:r>
-    </w:p>
-    <w:p>
-      <w:pPr>
-        <w:spacing w:after="80"/>
-      </w:pPr>
     </w:p>
     <w:p>
       <w:pPr>

</xml_diff>

<commit_message>
Remove .env file from tracking
</commit_message>
<xml_diff>
--- a/outputs/resume_backend_software_engineer_nexus_systems_1.docx
+++ b/outputs/resume_backend_software_engineer_nexus_systems_1.docx
@@ -45,24 +45,19 @@
         <w:spacing w:before="240" w:after="80"/>
       </w:pPr>
       <w:r>
-        <w:t xml:space="preserve">PROFESSIONAL SUMMARY</w:t>
-      </w:r>
-    </w:p>
-    <w:p>
-      <w:pPr>
-        <w:spacing w:after="80"/>
-      </w:pPr>
-    </w:p>
-    <w:p>
-      <w:pPr>
-        <w:spacing w:after="60"/>
-      </w:pPr>
-      <w:r>
-        <w:rPr>
-          <w:sz w:val="22"/>
-          <w:szCs w:val="22"/>
-        </w:rPr>
-        <w:t xml:space="preserve">Highly motivated Backend Software Engineer graduating from UC Berkeley, seeking to design and build scalable APIs and microservices for an enterprise SaaS platform. Proven ability to deliver reliable, high-performance systems using Python, FastAPI, and AWS, with strong skills in cloud deployment and cross-functional collaboration.</w:t>
+        <w:t xml:space="preserve">SUMMARY</w:t>
+      </w:r>
+    </w:p>
+    <w:p>
+      <w:pPr>
+        <w:spacing w:after="60"/>
+      </w:pPr>
+      <w:r>
+        <w:rPr>
+          <w:sz w:val="22"/>
+          <w:szCs w:val="22"/>
+        </w:rPr>
+        <w:t xml:space="preserve">Highly motivated Backend Software Engineer specializing in the design, build, and maintenance of scalable APIs and microservices. Proven ability to deliver reliable, high-performance systems for enterprise SaaS platforms, working effectively with cross-functional product and frontend teams.</w:t>
       </w:r>
     </w:p>
     <w:p>
@@ -79,72 +74,79 @@
         <w:spacing w:before="240" w:after="80"/>
       </w:pPr>
       <w:r>
-        <w:t xml:space="preserve">TECHNICAL SKILLS</w:t>
-      </w:r>
-    </w:p>
-    <w:p>
-      <w:pPr>
-        <w:spacing w:after="80"/>
-      </w:pPr>
-    </w:p>
-    <w:p>
-      <w:pPr>
-        <w:spacing w:after="60"/>
-      </w:pPr>
-      <w:r>
-        <w:rPr>
-          <w:sz w:val="22"/>
-          <w:szCs w:val="22"/>
-        </w:rPr>
-        <w:t xml:space="preserve">Backend &amp; Cloud: Python, FastAPI, Node.js/Express, AWS (EC2, S3, Lambda), Docker, Terraform (beginner), Git, GitHub Actions, Microservices, RESTful APIs, System Design, CI/CD</w:t>
-      </w:r>
-    </w:p>
-    <w:p>
-      <w:pPr>
-        <w:spacing w:after="60"/>
-      </w:pPr>
-      <w:r>
-        <w:rPr>
-          <w:sz w:val="22"/>
-          <w:szCs w:val="22"/>
-        </w:rPr>
-        <w:t xml:space="preserve">Databases: PostgreSQL, MySQL, MongoDB, Redis, SQL</w:t>
-      </w:r>
-    </w:p>
-    <w:p>
-      <w:pPr>
-        <w:spacing w:after="60"/>
-      </w:pPr>
-      <w:r>
-        <w:rPr>
-          <w:sz w:val="22"/>
-          <w:szCs w:val="22"/>
-        </w:rPr>
-        <w:t xml:space="preserve">Languages: JavaScript, TypeScript, Java, Bash</w:t>
-      </w:r>
-    </w:p>
-    <w:p>
-      <w:pPr>
-        <w:spacing w:after="60"/>
-      </w:pPr>
-      <w:r>
-        <w:rPr>
-          <w:sz w:val="22"/>
-          <w:szCs w:val="22"/>
-        </w:rPr>
-        <w:t xml:space="preserve">Testing &amp; Tools: pytest, Jest, Jira, Linux, VS Code</w:t>
-      </w:r>
-    </w:p>
-    <w:p>
-      <w:pPr>
-        <w:spacing w:after="60"/>
-      </w:pPr>
-      <w:r>
-        <w:rPr>
-          <w:sz w:val="22"/>
-          <w:szCs w:val="22"/>
-        </w:rPr>
-        <w:t xml:space="preserve">Other: React, PyTorch, scikit-learn, pandas, NumPy</w:t>
+        <w:t xml:space="preserve">SKILLS</w:t>
+      </w:r>
+    </w:p>
+    <w:p>
+      <w:pPr>
+        <w:spacing w:after="60"/>
+      </w:pPr>
+      <w:r>
+        <w:rPr>
+          <w:sz w:val="22"/>
+          <w:szCs w:val="22"/>
+        </w:rPr>
+        <w:t xml:space="preserve">Backend Languages: Python, Java, SQL, TypeScript, JavaScript, Bash</w:t>
+      </w:r>
+    </w:p>
+    <w:p>
+      <w:pPr>
+        <w:spacing w:after="60"/>
+      </w:pPr>
+      <w:r>
+        <w:rPr>
+          <w:sz w:val="22"/>
+          <w:szCs w:val="22"/>
+        </w:rPr>
+        <w:t xml:space="preserve">Backend Frameworks: FastAPI, Django, Node.js, Express</w:t>
+      </w:r>
+    </w:p>
+    <w:p>
+      <w:pPr>
+        <w:spacing w:after="60"/>
+      </w:pPr>
+      <w:r>
+        <w:rPr>
+          <w:sz w:val="22"/>
+          <w:szCs w:val="22"/>
+        </w:rPr>
+        <w:t xml:space="preserve">Databases: PostgreSQL, Redis, MySQL, MongoDB</w:t>
+      </w:r>
+    </w:p>
+    <w:p>
+      <w:pPr>
+        <w:spacing w:after="60"/>
+      </w:pPr>
+      <w:r>
+        <w:rPr>
+          <w:sz w:val="22"/>
+          <w:szCs w:val="22"/>
+        </w:rPr>
+        <w:t xml:space="preserve">Cloud &amp; DevOps: AWS (EC2, S3, Lambda), Docker, GitHub Actions, Terraform (beginner)</w:t>
+      </w:r>
+    </w:p>
+    <w:p>
+      <w:pPr>
+        <w:spacing w:after="60"/>
+      </w:pPr>
+      <w:r>
+        <w:rPr>
+          <w:sz w:val="22"/>
+          <w:szCs w:val="22"/>
+        </w:rPr>
+        <w:t xml:space="preserve">Tools &amp; Methodologies: Git, Linux, Jira, VS Code, Agile</w:t>
+      </w:r>
+    </w:p>
+    <w:p>
+      <w:pPr>
+        <w:spacing w:after="60"/>
+      </w:pPr>
+      <w:r>
+        <w:rPr>
+          <w:sz w:val="22"/>
+          <w:szCs w:val="22"/>
+        </w:rPr>
+        <w:t xml:space="preserve">Familiar with: PyTorch, scikit-learn, pandas, NumPy, Jupyter, React</w:t>
       </w:r>
     </w:p>
     <w:p>
@@ -166,6 +168,78 @@
     </w:p>
     <w:p>
       <w:pPr>
+        <w:spacing w:after="60"/>
+      </w:pPr>
+      <w:r>
+        <w:rPr>
+          <w:sz w:val="22"/>
+          <w:szCs w:val="22"/>
+        </w:rPr>
+        <w:t xml:space="preserve">Software Engineering Intern  |  DataBridge Inc.</w:t>
+      </w:r>
+    </w:p>
+    <w:p>
+      <w:pPr>
+        <w:spacing w:after="60"/>
+      </w:pPr>
+      <w:r>
+        <w:rPr>
+          <w:sz w:val="22"/>
+          <w:szCs w:val="22"/>
+        </w:rPr>
+        <w:t xml:space="preserve">June 2023 – August 2023  |  Remote</w:t>
+      </w:r>
+    </w:p>
+    <w:p>
+      <w:pPr>
+        <w:spacing w:after="60"/>
+      </w:pPr>
+      <w:r>
+        <w:rPr>
+          <w:sz w:val="22"/>
+          <w:szCs w:val="22"/>
+        </w:rPr>
+        <w:t xml:space="preserve">*   Designed and built a scalable FastAPI microservice to ingest and normalize customer data from 3 third-party APIs, reducing manual processing time by 60% and enhancing system reliability.</w:t>
+      </w:r>
+    </w:p>
+    <w:p>
+      <w:pPr>
+        <w:spacing w:after="60"/>
+      </w:pPr>
+      <w:r>
+        <w:rPr>
+          <w:sz w:val="22"/>
+          <w:szCs w:val="22"/>
+        </w:rPr>
+        <w:t xml:space="preserve">*   Collaborated closely with frontend teams to integrate backend WebSocket endpoints, enabling real-time data updates for dashboard components.</w:t>
+      </w:r>
+    </w:p>
+    <w:p>
+      <w:pPr>
+        <w:spacing w:after="60"/>
+      </w:pPr>
+      <w:r>
+        <w:rPr>
+          <w:sz w:val="22"/>
+          <w:szCs w:val="22"/>
+        </w:rPr>
+        <w:t xml:space="preserve">*   Ensured system reliability by writing comprehensive unit and integration tests, achieving 85% code coverage for critical microservices using pytest.</w:t>
+      </w:r>
+    </w:p>
+    <w:p>
+      <w:pPr>
+        <w:spacing w:after="60"/>
+      </w:pPr>
+      <w:r>
+        <w:rPr>
+          <w:sz w:val="22"/>
+          <w:szCs w:val="22"/>
+        </w:rPr>
+        <w:t xml:space="preserve">*   Participated in agile sprints and daily standups, collaborating with a cross-functional team including product and frontend engineers to deliver high-performance features.</w:t>
+      </w:r>
+    </w:p>
+    <w:p>
+      <w:pPr>
         <w:spacing w:after="80"/>
       </w:pPr>
     </w:p>
@@ -178,83 +252,6 @@
           <w:sz w:val="22"/>
           <w:szCs w:val="22"/>
         </w:rPr>
-        <w:t xml:space="preserve">Software Engineering Intern  |  DataBridge Inc.</w:t>
-      </w:r>
-    </w:p>
-    <w:p>
-      <w:pPr>
-        <w:spacing w:after="60"/>
-      </w:pPr>
-      <w:r>
-        <w:rPr>
-          <w:sz w:val="22"/>
-          <w:szCs w:val="22"/>
-        </w:rPr>
-        <w:t xml:space="preserve">June 2023 – August 2023  |  Remote</w:t>
-      </w:r>
-    </w:p>
-    <w:p>
-      <w:pPr>
-        <w:spacing w:after="60"/>
-      </w:pPr>
-      <w:r>
-        <w:rPr>
-          <w:sz w:val="22"/>
-          <w:szCs w:val="22"/>
-        </w:rPr>
-        <w:t xml:space="preserve">* Designed and built a scalable FastAPI microservice to ingest and normalize customer data from 3 third-party APIs, directly supporting core data operations for an enterprise platform, resulting in a 60% reduction in manual processing time.</w:t>
-      </w:r>
-    </w:p>
-    <w:p>
-      <w:pPr>
-        <w:spacing w:after="60"/>
-      </w:pPr>
-      <w:r>
-        <w:rPr>
-          <w:sz w:val="22"/>
-          <w:szCs w:val="22"/>
-        </w:rPr>
-        <w:t xml:space="preserve">* Collaborated closely with frontend teams to develop real-time React dashboard components using WebSockets, ensuring seamless data visualization for users.</w:t>
-      </w:r>
-    </w:p>
-    <w:p>
-      <w:pPr>
-        <w:spacing w:after="60"/>
-      </w:pPr>
-      <w:r>
-        <w:rPr>
-          <w:sz w:val="22"/>
-          <w:szCs w:val="22"/>
-        </w:rPr>
-        <w:t xml:space="preserve">* Ensured system reliability and performance by writing comprehensive unit and integration tests, achieving 85% code coverage with pytest and Jest.</w:t>
-      </w:r>
-    </w:p>
-    <w:p>
-      <w:pPr>
-        <w:spacing w:after="60"/>
-      </w:pPr>
-      <w:r>
-        <w:rPr>
-          <w:sz w:val="22"/>
-          <w:szCs w:val="22"/>
-        </w:rPr>
-        <w:t xml:space="preserve">* Actively participated in agile development sprints and daily standups within an 8-person cross-functional team, utilizing Jira to drive project delivery.</w:t>
-      </w:r>
-    </w:p>
-    <w:p>
-      <w:pPr>
-        <w:spacing w:after="80"/>
-      </w:pPr>
-    </w:p>
-    <w:p>
-      <w:pPr>
-        <w:spacing w:after="60"/>
-      </w:pPr>
-      <w:r>
-        <w:rPr>
-          <w:sz w:val="22"/>
-          <w:szCs w:val="22"/>
-        </w:rPr>
         <w:t xml:space="preserve">Undergraduate Research Assistant  |  UC Berkeley NLP Lab</w:t>
       </w:r>
     </w:p>
@@ -279,31 +276,31 @@
           <w:sz w:val="22"/>
           <w:szCs w:val="22"/>
         </w:rPr>
-        <w:t xml:space="preserve">* Engineered and fine-tuned a BERT-based text classification model on a custom dataset of 50K labeled samples, achieving 91% accuracy, demonstrating strong problem-solving and analytical skills applicable to complex system design.</w:t>
-      </w:r>
-    </w:p>
-    <w:p>
-      <w:pPr>
-        <w:spacing w:after="60"/>
-      </w:pPr>
-      <w:r>
-        <w:rPr>
-          <w:sz w:val="22"/>
-          <w:szCs w:val="22"/>
-        </w:rPr>
-        <w:t xml:space="preserve">* Developed an automated data preprocessing pipeline using pandas and spaCy, significantly improving efficiency by reducing preparation time from 6 hours to under 30 minutes.</w:t>
-      </w:r>
-    </w:p>
-    <w:p>
-      <w:pPr>
-        <w:spacing w:after="60"/>
-      </w:pPr>
-      <w:r>
-        <w:rPr>
-          <w:sz w:val="22"/>
-          <w:szCs w:val="22"/>
-        </w:rPr>
-        <w:t xml:space="preserve">* Contributed to a paper draft and presented findings to a group of 15 researchers.</w:t>
+        <w:t xml:space="preserve">*   Developed and fine-tuned machine learning models, demonstrating strong analytical skills applicable to building intelligent features within an enterprise SaaS platform.</w:t>
+      </w:r>
+    </w:p>
+    <w:p>
+      <w:pPr>
+        <w:spacing w:after="60"/>
+      </w:pPr>
+      <w:r>
+        <w:rPr>
+          <w:sz w:val="22"/>
+          <w:szCs w:val="22"/>
+        </w:rPr>
+        <w:t xml:space="preserve">*   Engineered robust data preprocessing pipelines, reducing data preparation time from 6 hours to under 30 minutes, highlighting efficiency in data handling for scalable systems.</w:t>
+      </w:r>
+    </w:p>
+    <w:p>
+      <w:pPr>
+        <w:spacing w:after="60"/>
+      </w:pPr>
+      <w:r>
+        <w:rPr>
+          <w:sz w:val="22"/>
+          <w:szCs w:val="22"/>
+        </w:rPr>
+        <w:t xml:space="preserve">*   Presented technical findings to researchers, showcasing communication skills vital for collaboration with product and frontend teams.</w:t>
       </w:r>
     </w:p>
     <w:p>
@@ -325,6 +322,54 @@
     </w:p>
     <w:p>
       <w:pPr>
+        <w:spacing w:after="60"/>
+      </w:pPr>
+      <w:r>
+        <w:rPr>
+          <w:sz w:val="22"/>
+          <w:szCs w:val="22"/>
+        </w:rPr>
+        <w:t xml:space="preserve">JobTracker — Scalable Backend Application  github.com/alexmorgan/jobtracker</w:t>
+      </w:r>
+    </w:p>
+    <w:p>
+      <w:pPr>
+        <w:spacing w:after="60"/>
+      </w:pPr>
+      <w:r>
+        <w:rPr>
+          <w:sz w:val="22"/>
+          <w:szCs w:val="22"/>
+        </w:rPr>
+        <w:t xml:space="preserve">*   Designed and built the backend for a job application tracker, leveraging Node.js/Express and PostgreSQL to manage data for a scalable web application.</w:t>
+      </w:r>
+    </w:p>
+    <w:p>
+      <w:pPr>
+        <w:spacing w:after="60"/>
+      </w:pPr>
+      <w:r>
+        <w:rPr>
+          <w:sz w:val="22"/>
+          <w:szCs w:val="22"/>
+        </w:rPr>
+        <w:t xml:space="preserve">*   Implemented robust JWT-based authentication and role-based access control for secure API endpoints.</w:t>
+      </w:r>
+    </w:p>
+    <w:p>
+      <w:pPr>
+        <w:spacing w:after="60"/>
+      </w:pPr>
+      <w:r>
+        <w:rPr>
+          <w:sz w:val="22"/>
+          <w:szCs w:val="22"/>
+        </w:rPr>
+        <w:t xml:space="preserve">*   Deployed the backend on AWS EC2 with Nginx reverse proxy and established CI/CD pipelines via GitHub Actions for reliable, automated deployments.</w:t>
+      </w:r>
+    </w:p>
+    <w:p>
+      <w:pPr>
         <w:spacing w:after="80"/>
       </w:pPr>
     </w:p>
@@ -337,96 +382,43 @@
           <w:sz w:val="22"/>
           <w:szCs w:val="22"/>
         </w:rPr>
-        <w:t xml:space="preserve">JobTracker — Full Stack Web App  github.com/alexmorgan/jobtracker</w:t>
-      </w:r>
-    </w:p>
-    <w:p>
-      <w:pPr>
-        <w:spacing w:after="60"/>
-      </w:pPr>
-      <w:r>
-        <w:rPr>
-          <w:sz w:val="22"/>
-          <w:szCs w:val="22"/>
-        </w:rPr>
-        <w:t xml:space="preserve">* Designed and implemented a full-stack job application tracker, leveraging Node.js/Express as the backend for scalable APIs and PostgreSQL for robust data management.</w:t>
-      </w:r>
-    </w:p>
-    <w:p>
-      <w:pPr>
-        <w:spacing w:after="60"/>
-      </w:pPr>
-      <w:r>
-        <w:rPr>
-          <w:sz w:val="22"/>
-          <w:szCs w:val="22"/>
-        </w:rPr>
-        <w:t xml:space="preserve">* Integrated secure JWT-based authentication and role-based access control to ensure system reliability and data integrity.</w:t>
-      </w:r>
-    </w:p>
-    <w:p>
-      <w:pPr>
-        <w:spacing w:after="60"/>
-      </w:pPr>
-      <w:r>
-        <w:rPr>
-          <w:sz w:val="22"/>
-          <w:szCs w:val="22"/>
-        </w:rPr>
-        <w:t xml:space="preserve">* Orchestrated high-performance system deployment on AWS EC2 with Nginx, implementing automated CI/CD via GitHub Actions for continuous delivery.</w:t>
-      </w:r>
-    </w:p>
-    <w:p>
-      <w:pPr>
-        <w:spacing w:after="80"/>
-      </w:pPr>
-    </w:p>
-    <w:p>
-      <w:pPr>
-        <w:spacing w:after="60"/>
-      </w:pPr>
-      <w:r>
-        <w:rPr>
-          <w:sz w:val="22"/>
-          <w:szCs w:val="22"/>
-        </w:rPr>
-        <w:t xml:space="preserve">SentimentLens — ML Pipeline  github.com/alexmorgan/sentimentlens</w:t>
-      </w:r>
-    </w:p>
-    <w:p>
-      <w:pPr>
-        <w:spacing w:after="60"/>
-      </w:pPr>
-      <w:r>
-        <w:rPr>
-          <w:sz w:val="22"/>
-          <w:szCs w:val="22"/>
-        </w:rPr>
-        <w:t xml:space="preserve">* Developed and trained a sentiment analysis model on 100K product reviews, showcasing data processing and model deployment skills.</w:t>
-      </w:r>
-    </w:p>
-    <w:p>
-      <w:pPr>
-        <w:spacing w:after="60"/>
-      </w:pPr>
-      <w:r>
-        <w:rPr>
-          <w:sz w:val="22"/>
-          <w:szCs w:val="22"/>
-        </w:rPr>
-        <w:t xml:space="preserve">* Engineered a scalable FastAPI endpoint to expose model inference, utilizing Docker for efficient containerization and deployment.</w:t>
-      </w:r>
-    </w:p>
-    <w:p>
-      <w:pPr>
-        <w:spacing w:after="60"/>
-      </w:pPr>
-      <w:r>
-        <w:rPr>
-          <w:sz w:val="22"/>
-          <w:szCs w:val="22"/>
-        </w:rPr>
-        <w:t xml:space="preserve">* Achieved F1-score of 0.89 on the held-out test set.</w:t>
+        <w:t xml:space="preserve">SentimentLens — Microservice ML Pipeline  github.com/alexmorgan/sentimentlens</w:t>
+      </w:r>
+    </w:p>
+    <w:p>
+      <w:pPr>
+        <w:spacing w:after="60"/>
+      </w:pPr>
+      <w:r>
+        <w:rPr>
+          <w:sz w:val="22"/>
+          <w:szCs w:val="22"/>
+        </w:rPr>
+        <w:t xml:space="preserve">*   Developed and trained a sentiment analysis model, demonstrating proficiency in data-driven feature development.</w:t>
+      </w:r>
+    </w:p>
+    <w:p>
+      <w:pPr>
+        <w:spacing w:after="60"/>
+      </w:pPr>
+      <w:r>
+        <w:rPr>
+          <w:sz w:val="22"/>
+          <w:szCs w:val="22"/>
+        </w:rPr>
+        <w:t xml:space="preserve">*   Exposed model inference via a scalable FastAPI endpoint, containerized with Docker for reliable deployment as a microservice.</w:t>
+      </w:r>
+    </w:p>
+    <w:p>
+      <w:pPr>
+        <w:spacing w:after="60"/>
+      </w:pPr>
+      <w:r>
+        <w:rPr>
+          <w:sz w:val="22"/>
+          <w:szCs w:val="22"/>
+        </w:rPr>
+        <w:t xml:space="preserve">*   Validated model performance with an F1-score of 0.89, ensuring high accuracy for potential integration into enterprise SaaS features.</w:t>
       </w:r>
     </w:p>
     <w:p>
@@ -448,11 +440,6 @@
     </w:p>
     <w:p>
       <w:pPr>
-        <w:spacing w:after="80"/>
-      </w:pPr>
-    </w:p>
-    <w:p>
-      <w:pPr>
         <w:spacing w:after="60"/>
       </w:pPr>
       <w:r>
@@ -515,11 +502,6 @@
       <w:r>
         <w:t xml:space="preserve">CERTIFICATIONS &amp; ACTIVITIES</w:t>
       </w:r>
-    </w:p>
-    <w:p>
-      <w:pPr>
-        <w:spacing w:after="80"/>
-      </w:pPr>
     </w:p>
     <w:p>
       <w:pPr>

</xml_diff>

<commit_message>
Initial commit: AI resume tailoring agent
</commit_message>
<xml_diff>
--- a/outputs/resume_backend_software_engineer_nexus_systems_1.docx
+++ b/outputs/resume_backend_software_engineer_nexus_systems_1.docx
@@ -28,7 +28,7 @@
           <w:sz w:val="22"/>
           <w:szCs w:val="22"/>
         </w:rPr>
-        <w:t xml:space="preserve">San Francisco, CA  •  alex.morgan@email.com  •  (415) 555-0182  •  github.com/alexmorgan  •  linkedin.com/in/alexmorgan</w:t>
+        <w:t xml:space="preserve">San Francisco, CA • alex.morgan@email.com • (415) 555-0182 • github.com/alexmorgan • linkedin.com/in/alexmorgan</w:t>
       </w:r>
     </w:p>
     <w:p>
@@ -50,14 +50,19 @@
     </w:p>
     <w:p>
       <w:pPr>
-        <w:spacing w:after="60"/>
-      </w:pPr>
-      <w:r>
-        <w:rPr>
-          <w:sz w:val="22"/>
-          <w:szCs w:val="22"/>
-        </w:rPr>
-        <w:t xml:space="preserve">Highly motivated Backend Software Engineer specializing in the design, build, and maintenance of scalable APIs and microservices. Proven ability to deliver reliable, high-performance systems for enterprise SaaS platforms, working effectively with cross-functional product and frontend teams.</w:t>
+        <w:spacing w:after="80"/>
+      </w:pPr>
+    </w:p>
+    <w:p>
+      <w:pPr>
+        <w:spacing w:after="60"/>
+      </w:pPr>
+      <w:r>
+        <w:rPr>
+          <w:sz w:val="22"/>
+          <w:szCs w:val="22"/>
+        </w:rPr>
+        <w:t xml:space="preserve">Highly analytical Computer Science graduate with hands-on experience as a Backend Software Engineer, specializing in designing and building scalable APIs and microservices. Proven ability to deliver reliable, high-performance systems for enterprise SaaS platforms, leveraging Python, FastAPI, and AWS. Eager to contribute to Nexus Systems' innovative backend solutions.</w:t>
       </w:r>
     </w:p>
     <w:p>
@@ -74,79 +79,72 @@
         <w:spacing w:before="240" w:after="80"/>
       </w:pPr>
       <w:r>
-        <w:t xml:space="preserve">SKILLS</w:t>
-      </w:r>
-    </w:p>
-    <w:p>
-      <w:pPr>
-        <w:spacing w:after="60"/>
-      </w:pPr>
-      <w:r>
-        <w:rPr>
-          <w:sz w:val="22"/>
-          <w:szCs w:val="22"/>
-        </w:rPr>
-        <w:t xml:space="preserve">Backend Languages: Python, Java, SQL, TypeScript, JavaScript, Bash</w:t>
-      </w:r>
-    </w:p>
-    <w:p>
-      <w:pPr>
-        <w:spacing w:after="60"/>
-      </w:pPr>
-      <w:r>
-        <w:rPr>
-          <w:sz w:val="22"/>
-          <w:szCs w:val="22"/>
-        </w:rPr>
-        <w:t xml:space="preserve">Backend Frameworks: FastAPI, Django, Node.js, Express</w:t>
-      </w:r>
-    </w:p>
-    <w:p>
-      <w:pPr>
-        <w:spacing w:after="60"/>
-      </w:pPr>
-      <w:r>
-        <w:rPr>
-          <w:sz w:val="22"/>
-          <w:szCs w:val="22"/>
-        </w:rPr>
-        <w:t xml:space="preserve">Databases: PostgreSQL, Redis, MySQL, MongoDB</w:t>
-      </w:r>
-    </w:p>
-    <w:p>
-      <w:pPr>
-        <w:spacing w:after="60"/>
-      </w:pPr>
-      <w:r>
-        <w:rPr>
-          <w:sz w:val="22"/>
-          <w:szCs w:val="22"/>
-        </w:rPr>
-        <w:t xml:space="preserve">Cloud &amp; DevOps: AWS (EC2, S3, Lambda), Docker, GitHub Actions, Terraform (beginner)</w:t>
-      </w:r>
-    </w:p>
-    <w:p>
-      <w:pPr>
-        <w:spacing w:after="60"/>
-      </w:pPr>
-      <w:r>
-        <w:rPr>
-          <w:sz w:val="22"/>
-          <w:szCs w:val="22"/>
-        </w:rPr>
-        <w:t xml:space="preserve">Tools &amp; Methodologies: Git, Linux, Jira, VS Code, Agile</w:t>
-      </w:r>
-    </w:p>
-    <w:p>
-      <w:pPr>
-        <w:spacing w:after="60"/>
-      </w:pPr>
-      <w:r>
-        <w:rPr>
-          <w:sz w:val="22"/>
-          <w:szCs w:val="22"/>
-        </w:rPr>
-        <w:t xml:space="preserve">Familiar with: PyTorch, scikit-learn, pandas, NumPy, Jupyter, React</w:t>
+        <w:t xml:space="preserve">TECHNICAL SKILLS</w:t>
+      </w:r>
+    </w:p>
+    <w:p>
+      <w:pPr>
+        <w:spacing w:after="80"/>
+      </w:pPr>
+    </w:p>
+    <w:p>
+      <w:pPr>
+        <w:spacing w:after="60"/>
+      </w:pPr>
+      <w:r>
+        <w:rPr>
+          <w:sz w:val="22"/>
+          <w:szCs w:val="22"/>
+        </w:rPr>
+        <w:t xml:space="preserve">Backend Languages &amp; Frameworks: Python, FastAPI, Node.js, Django, Java, JavaScript, TypeScript</w:t>
+      </w:r>
+    </w:p>
+    <w:p>
+      <w:pPr>
+        <w:spacing w:after="60"/>
+      </w:pPr>
+      <w:r>
+        <w:rPr>
+          <w:sz w:val="22"/>
+          <w:szCs w:val="22"/>
+        </w:rPr>
+        <w:t xml:space="preserve">Cloud &amp; DevOps: AWS (EC2, S3, Lambda), Docker, GitHub Actions, Terraform</w:t>
+      </w:r>
+    </w:p>
+    <w:p>
+      <w:pPr>
+        <w:spacing w:after="60"/>
+      </w:pPr>
+      <w:r>
+        <w:rPr>
+          <w:sz w:val="22"/>
+          <w:szCs w:val="22"/>
+        </w:rPr>
+        <w:t xml:space="preserve">Databases &amp; Query Languages: PostgreSQL, MySQL, Redis, MongoDB, SQL</w:t>
+      </w:r>
+    </w:p>
+    <w:p>
+      <w:pPr>
+        <w:spacing w:after="60"/>
+      </w:pPr>
+      <w:r>
+        <w:rPr>
+          <w:sz w:val="22"/>
+          <w:szCs w:val="22"/>
+        </w:rPr>
+        <w:t xml:space="preserve">Tools &amp; Methodologies: Git, Linux, Jira, VS Code, Agile Development</w:t>
+      </w:r>
+    </w:p>
+    <w:p>
+      <w:pPr>
+        <w:spacing w:after="60"/>
+      </w:pPr>
+      <w:r>
+        <w:rPr>
+          <w:sz w:val="22"/>
+          <w:szCs w:val="22"/>
+        </w:rPr>
+        <w:t xml:space="preserve">Additional Technical Skills: PyTorch, scikit-learn, pandas, NumPy</w:t>
       </w:r>
     </w:p>
     <w:p>
@@ -168,139 +166,154 @@
     </w:p>
     <w:p>
       <w:pPr>
-        <w:spacing w:after="60"/>
-      </w:pPr>
-      <w:r>
-        <w:rPr>
-          <w:sz w:val="22"/>
-          <w:szCs w:val="22"/>
-        </w:rPr>
-        <w:t xml:space="preserve">Software Engineering Intern  |  DataBridge Inc.</w:t>
-      </w:r>
-    </w:p>
-    <w:p>
-      <w:pPr>
-        <w:spacing w:after="60"/>
-      </w:pPr>
-      <w:r>
-        <w:rPr>
-          <w:sz w:val="22"/>
-          <w:szCs w:val="22"/>
-        </w:rPr>
-        <w:t xml:space="preserve">June 2023 – August 2023  |  Remote</w:t>
-      </w:r>
-    </w:p>
-    <w:p>
-      <w:pPr>
-        <w:spacing w:after="60"/>
-      </w:pPr>
-      <w:r>
-        <w:rPr>
-          <w:sz w:val="22"/>
-          <w:szCs w:val="22"/>
-        </w:rPr>
-        <w:t xml:space="preserve">*   Designed and built a scalable FastAPI microservice to ingest and normalize customer data from 3 third-party APIs, reducing manual processing time by 60% and enhancing system reliability.</w:t>
-      </w:r>
-    </w:p>
-    <w:p>
-      <w:pPr>
-        <w:spacing w:after="60"/>
-      </w:pPr>
-      <w:r>
-        <w:rPr>
-          <w:sz w:val="22"/>
-          <w:szCs w:val="22"/>
-        </w:rPr>
-        <w:t xml:space="preserve">*   Collaborated closely with frontend teams to integrate backend WebSocket endpoints, enabling real-time data updates for dashboard components.</w:t>
-      </w:r>
-    </w:p>
-    <w:p>
-      <w:pPr>
-        <w:spacing w:after="60"/>
-      </w:pPr>
-      <w:r>
-        <w:rPr>
-          <w:sz w:val="22"/>
-          <w:szCs w:val="22"/>
-        </w:rPr>
-        <w:t xml:space="preserve">*   Ensured system reliability by writing comprehensive unit and integration tests, achieving 85% code coverage for critical microservices using pytest.</w:t>
-      </w:r>
-    </w:p>
-    <w:p>
-      <w:pPr>
-        <w:spacing w:after="60"/>
-      </w:pPr>
-      <w:r>
-        <w:rPr>
-          <w:sz w:val="22"/>
-          <w:szCs w:val="22"/>
-        </w:rPr>
-        <w:t xml:space="preserve">*   Participated in agile sprints and daily standups, collaborating with a cross-functional team including product and frontend engineers to deliver high-performance features.</w:t>
-      </w:r>
-    </w:p>
-    <w:p>
-      <w:pPr>
-        <w:spacing w:after="80"/>
-      </w:pPr>
-    </w:p>
-    <w:p>
-      <w:pPr>
-        <w:spacing w:after="60"/>
-      </w:pPr>
-      <w:r>
-        <w:rPr>
-          <w:sz w:val="22"/>
-          <w:szCs w:val="22"/>
-        </w:rPr>
-        <w:t xml:space="preserve">Undergraduate Research Assistant  |  UC Berkeley NLP Lab</w:t>
-      </w:r>
-    </w:p>
-    <w:p>
-      <w:pPr>
-        <w:spacing w:after="60"/>
-      </w:pPr>
-      <w:r>
-        <w:rPr>
-          <w:sz w:val="22"/>
-          <w:szCs w:val="22"/>
-        </w:rPr>
-        <w:t xml:space="preserve">January 2023 – May 2023  |  Berkeley, CA</w:t>
-      </w:r>
-    </w:p>
-    <w:p>
-      <w:pPr>
-        <w:spacing w:after="60"/>
-      </w:pPr>
-      <w:r>
-        <w:rPr>
-          <w:sz w:val="22"/>
-          <w:szCs w:val="22"/>
-        </w:rPr>
-        <w:t xml:space="preserve">*   Developed and fine-tuned machine learning models, demonstrating strong analytical skills applicable to building intelligent features within an enterprise SaaS platform.</w:t>
-      </w:r>
-    </w:p>
-    <w:p>
-      <w:pPr>
-        <w:spacing w:after="60"/>
-      </w:pPr>
-      <w:r>
-        <w:rPr>
-          <w:sz w:val="22"/>
-          <w:szCs w:val="22"/>
-        </w:rPr>
-        <w:t xml:space="preserve">*   Engineered robust data preprocessing pipelines, reducing data preparation time from 6 hours to under 30 minutes, highlighting efficiency in data handling for scalable systems.</w:t>
-      </w:r>
-    </w:p>
-    <w:p>
-      <w:pPr>
-        <w:spacing w:after="60"/>
-      </w:pPr>
-      <w:r>
-        <w:rPr>
-          <w:sz w:val="22"/>
-          <w:szCs w:val="22"/>
-        </w:rPr>
-        <w:t xml:space="preserve">*   Presented technical findings to researchers, showcasing communication skills vital for collaboration with product and frontend teams.</w:t>
+        <w:spacing w:after="80"/>
+      </w:pPr>
+    </w:p>
+    <w:p>
+      <w:pPr>
+        <w:spacing w:after="60"/>
+      </w:pPr>
+      <w:r>
+        <w:rPr>
+          <w:sz w:val="22"/>
+          <w:szCs w:val="22"/>
+        </w:rPr>
+        <w:t xml:space="preserve">Software Engineering Intern | DataBridge Inc.</w:t>
+      </w:r>
+    </w:p>
+    <w:p>
+      <w:pPr>
+        <w:spacing w:after="60"/>
+      </w:pPr>
+      <w:r>
+        <w:rPr>
+          <w:sz w:val="22"/>
+          <w:szCs w:val="22"/>
+        </w:rPr>
+        <w:t xml:space="preserve">June 2023 – August 2023 | Remote</w:t>
+      </w:r>
+    </w:p>
+    <w:p>
+      <w:pPr>
+        <w:spacing w:after="80"/>
+      </w:pPr>
+    </w:p>
+    <w:p>
+      <w:pPr>
+        <w:spacing w:after="60"/>
+      </w:pPr>
+      <w:r>
+        <w:rPr>
+          <w:sz w:val="22"/>
+          <w:szCs w:val="22"/>
+        </w:rPr>
+        <w:t xml:space="preserve">*   Engineered a scalable FastAPI microservice to ingest and normalize customer data from 3 third-party APIs, enhancing data reliability for an enterprise SaaS platform and reducing manual processing time by 60%.</w:t>
+      </w:r>
+    </w:p>
+    <w:p>
+      <w:pPr>
+        <w:spacing w:after="60"/>
+      </w:pPr>
+      <w:r>
+        <w:rPr>
+          <w:sz w:val="22"/>
+          <w:szCs w:val="22"/>
+        </w:rPr>
+        <w:t xml:space="preserve">*   Collaborated closely with frontend teams to implement real-time data streaming via WebSockets for dashboard components, ensuring high-performance data delivery from backend systems.</w:t>
+      </w:r>
+    </w:p>
+    <w:p>
+      <w:pPr>
+        <w:spacing w:after="60"/>
+      </w:pPr>
+      <w:r>
+        <w:rPr>
+          <w:sz w:val="22"/>
+          <w:szCs w:val="22"/>
+        </w:rPr>
+        <w:t xml:space="preserve">*   Implemented comprehensive unit and integration tests, achieving 85% code coverage, to ensure the reliability and maintainability of backend services.</w:t>
+      </w:r>
+    </w:p>
+    <w:p>
+      <w:pPr>
+        <w:spacing w:after="60"/>
+      </w:pPr>
+      <w:r>
+        <w:rPr>
+          <w:sz w:val="22"/>
+          <w:szCs w:val="22"/>
+        </w:rPr>
+        <w:t xml:space="preserve">*   Participated in agile sprints with a cross-functional team, delivering features for an enterprise SaaS platform.</w:t>
+      </w:r>
+    </w:p>
+    <w:p>
+      <w:pPr>
+        <w:spacing w:after="80"/>
+      </w:pPr>
+    </w:p>
+    <w:p>
+      <w:pPr>
+        <w:spacing w:after="60"/>
+      </w:pPr>
+      <w:r>
+        <w:rPr>
+          <w:sz w:val="22"/>
+          <w:szCs w:val="22"/>
+        </w:rPr>
+        <w:t xml:space="preserve">Undergraduate Research Assistant | UC Berkeley NLP Lab</w:t>
+      </w:r>
+    </w:p>
+    <w:p>
+      <w:pPr>
+        <w:spacing w:after="60"/>
+      </w:pPr>
+      <w:r>
+        <w:rPr>
+          <w:sz w:val="22"/>
+          <w:szCs w:val="22"/>
+        </w:rPr>
+        <w:t xml:space="preserve">January 2023 – May 2023 | Berkeley, CA</w:t>
+      </w:r>
+    </w:p>
+    <w:p>
+      <w:pPr>
+        <w:spacing w:after="80"/>
+      </w:pPr>
+    </w:p>
+    <w:p>
+      <w:pPr>
+        <w:spacing w:after="60"/>
+      </w:pPr>
+      <w:r>
+        <w:rPr>
+          <w:sz w:val="22"/>
+          <w:szCs w:val="22"/>
+        </w:rPr>
+        <w:t xml:space="preserve">*   Developed and fine-tuned a BERT-based text classification model on a custom dataset of 50K labeled samples, demonstrating ability to handle large-scale data processing workflows.</w:t>
+      </w:r>
+    </w:p>
+    <w:p>
+      <w:pPr>
+        <w:spacing w:after="60"/>
+      </w:pPr>
+      <w:r>
+        <w:rPr>
+          <w:sz w:val="22"/>
+          <w:szCs w:val="22"/>
+        </w:rPr>
+        <w:t xml:space="preserve">*   Automated a data preprocessing pipeline using pandas and spaCy, significantly improving efficiency and reducing data preparation time from 6 hours to under 30 minutes, critical for reliable data input into systems.</w:t>
+      </w:r>
+    </w:p>
+    <w:p>
+      <w:pPr>
+        <w:spacing w:after="60"/>
+      </w:pPr>
+      <w:r>
+        <w:rPr>
+          <w:sz w:val="22"/>
+          <w:szCs w:val="22"/>
+        </w:rPr>
+        <w:t xml:space="preserve">*   Presented research findings to a technical audience, refining communication skills for collaborative project delivery.</w:t>
       </w:r>
     </w:p>
     <w:p>
@@ -322,103 +335,118 @@
     </w:p>
     <w:p>
       <w:pPr>
-        <w:spacing w:after="60"/>
-      </w:pPr>
-      <w:r>
-        <w:rPr>
-          <w:sz w:val="22"/>
-          <w:szCs w:val="22"/>
-        </w:rPr>
-        <w:t xml:space="preserve">JobTracker — Scalable Backend Application  github.com/alexmorgan/jobtracker</w:t>
-      </w:r>
-    </w:p>
-    <w:p>
-      <w:pPr>
-        <w:spacing w:after="60"/>
-      </w:pPr>
-      <w:r>
-        <w:rPr>
-          <w:sz w:val="22"/>
-          <w:szCs w:val="22"/>
-        </w:rPr>
-        <w:t xml:space="preserve">*   Designed and built the backend for a job application tracker, leveraging Node.js/Express and PostgreSQL to manage data for a scalable web application.</w:t>
-      </w:r>
-    </w:p>
-    <w:p>
-      <w:pPr>
-        <w:spacing w:after="60"/>
-      </w:pPr>
-      <w:r>
-        <w:rPr>
-          <w:sz w:val="22"/>
-          <w:szCs w:val="22"/>
-        </w:rPr>
-        <w:t xml:space="preserve">*   Implemented robust JWT-based authentication and role-based access control for secure API endpoints.</w:t>
-      </w:r>
-    </w:p>
-    <w:p>
-      <w:pPr>
-        <w:spacing w:after="60"/>
-      </w:pPr>
-      <w:r>
-        <w:rPr>
-          <w:sz w:val="22"/>
-          <w:szCs w:val="22"/>
-        </w:rPr>
-        <w:t xml:space="preserve">*   Deployed the backend on AWS EC2 with Nginx reverse proxy and established CI/CD pipelines via GitHub Actions for reliable, automated deployments.</w:t>
-      </w:r>
-    </w:p>
-    <w:p>
-      <w:pPr>
-        <w:spacing w:after="80"/>
-      </w:pPr>
-    </w:p>
-    <w:p>
-      <w:pPr>
-        <w:spacing w:after="60"/>
-      </w:pPr>
-      <w:r>
-        <w:rPr>
-          <w:sz w:val="22"/>
-          <w:szCs w:val="22"/>
-        </w:rPr>
-        <w:t xml:space="preserve">SentimentLens — Microservice ML Pipeline  github.com/alexmorgan/sentimentlens</w:t>
-      </w:r>
-    </w:p>
-    <w:p>
-      <w:pPr>
-        <w:spacing w:after="60"/>
-      </w:pPr>
-      <w:r>
-        <w:rPr>
-          <w:sz w:val="22"/>
-          <w:szCs w:val="22"/>
-        </w:rPr>
-        <w:t xml:space="preserve">*   Developed and trained a sentiment analysis model, demonstrating proficiency in data-driven feature development.</w:t>
-      </w:r>
-    </w:p>
-    <w:p>
-      <w:pPr>
-        <w:spacing w:after="60"/>
-      </w:pPr>
-      <w:r>
-        <w:rPr>
-          <w:sz w:val="22"/>
-          <w:szCs w:val="22"/>
-        </w:rPr>
-        <w:t xml:space="preserve">*   Exposed model inference via a scalable FastAPI endpoint, containerized with Docker for reliable deployment as a microservice.</w:t>
-      </w:r>
-    </w:p>
-    <w:p>
-      <w:pPr>
-        <w:spacing w:after="60"/>
-      </w:pPr>
-      <w:r>
-        <w:rPr>
-          <w:sz w:val="22"/>
-          <w:szCs w:val="22"/>
-        </w:rPr>
-        <w:t xml:space="preserve">*   Validated model performance with an F1-score of 0.89, ensuring high accuracy for potential integration into enterprise SaaS features.</w:t>
+        <w:spacing w:after="80"/>
+      </w:pPr>
+    </w:p>
+    <w:p>
+      <w:pPr>
+        <w:spacing w:after="60"/>
+      </w:pPr>
+      <w:r>
+        <w:rPr>
+          <w:sz w:val="22"/>
+          <w:szCs w:val="22"/>
+        </w:rPr>
+        <w:t xml:space="preserve">JobTracker — Backend System  github.com/alexmorgan/jobtracker</w:t>
+      </w:r>
+    </w:p>
+    <w:p>
+      <w:pPr>
+        <w:spacing w:after="80"/>
+      </w:pPr>
+    </w:p>
+    <w:p>
+      <w:pPr>
+        <w:spacing w:after="60"/>
+      </w:pPr>
+      <w:r>
+        <w:rPr>
+          <w:sz w:val="22"/>
+          <w:szCs w:val="22"/>
+        </w:rPr>
+        <w:t xml:space="preserve">*   Engineered a robust backend for a job application tracker using Node.js/Express and PostgreSQL, demonstrating ability to build reliable systems for data management.</w:t>
+      </w:r>
+    </w:p>
+    <w:p>
+      <w:pPr>
+        <w:spacing w:after="60"/>
+      </w:pPr>
+      <w:r>
+        <w:rPr>
+          <w:sz w:val="22"/>
+          <w:szCs w:val="22"/>
+        </w:rPr>
+        <w:t xml:space="preserve">*   Implemented JWT-based authentication and role-based access control for secure API endpoints, a critical component of scalable enterprise platforms.</w:t>
+      </w:r>
+    </w:p>
+    <w:p>
+      <w:pPr>
+        <w:spacing w:after="60"/>
+      </w:pPr>
+      <w:r>
+        <w:rPr>
+          <w:sz w:val="22"/>
+          <w:szCs w:val="22"/>
+        </w:rPr>
+        <w:t xml:space="preserve">*   Deployed the backend on AWS EC2 with Nginx, utilizing GitHub Actions for automated, reliable CI/CD pipelines, supporting high-performance system delivery.</w:t>
+      </w:r>
+    </w:p>
+    <w:p>
+      <w:pPr>
+        <w:spacing w:after="80"/>
+      </w:pPr>
+    </w:p>
+    <w:p>
+      <w:pPr>
+        <w:spacing w:after="60"/>
+      </w:pPr>
+      <w:r>
+        <w:rPr>
+          <w:sz w:val="22"/>
+          <w:szCs w:val="22"/>
+        </w:rPr>
+        <w:t xml:space="preserve">SentimentLens — ML Microservice  github.com/alexmorgan/sentimentlens</w:t>
+      </w:r>
+    </w:p>
+    <w:p>
+      <w:pPr>
+        <w:spacing w:after="80"/>
+      </w:pPr>
+    </w:p>
+    <w:p>
+      <w:pPr>
+        <w:spacing w:after="60"/>
+      </w:pPr>
+      <w:r>
+        <w:rPr>
+          <w:sz w:val="22"/>
+          <w:szCs w:val="22"/>
+        </w:rPr>
+        <w:t xml:space="preserve">*   Developed a scalable data processing and inference pipeline for sentiment analysis on 100K product reviews using PyTorch and HuggingFace Transformers.</w:t>
+      </w:r>
+    </w:p>
+    <w:p>
+      <w:pPr>
+        <w:spacing w:after="60"/>
+      </w:pPr>
+      <w:r>
+        <w:rPr>
+          <w:sz w:val="22"/>
+          <w:szCs w:val="22"/>
+        </w:rPr>
+        <w:t xml:space="preserve">*   Exposed machine learning inference as a high-performance FastAPI endpoint, containerized with Docker for seamless deployment as a microservice.</w:t>
+      </w:r>
+    </w:p>
+    <w:p>
+      <w:pPr>
+        <w:spacing w:after="60"/>
+      </w:pPr>
+      <w:r>
+        <w:rPr>
+          <w:sz w:val="22"/>
+          <w:szCs w:val="22"/>
+        </w:rPr>
+        <w:t xml:space="preserve">*   Achieved an F1-score of 0.89, demonstrating accuracy and reliability in data-driven service outputs.</w:t>
       </w:r>
     </w:p>
     <w:p>
@@ -440,26 +468,31 @@
     </w:p>
     <w:p>
       <w:pPr>
-        <w:spacing w:after="60"/>
-      </w:pPr>
-      <w:r>
-        <w:rPr>
-          <w:sz w:val="22"/>
-          <w:szCs w:val="22"/>
-        </w:rPr>
-        <w:t xml:space="preserve">University of California, Berkeley  —  B.S. Computer Science</w:t>
-      </w:r>
-    </w:p>
-    <w:p>
-      <w:pPr>
-        <w:spacing w:after="60"/>
-      </w:pPr>
-      <w:r>
-        <w:rPr>
-          <w:sz w:val="22"/>
-          <w:szCs w:val="22"/>
-        </w:rPr>
-        <w:t xml:space="preserve">Graduated May 2024  |  GPA: 3.7 / 4.0  |  Dean's List (4 semesters)</w:t>
+        <w:spacing w:after="80"/>
+      </w:pPr>
+    </w:p>
+    <w:p>
+      <w:pPr>
+        <w:spacing w:after="60"/>
+      </w:pPr>
+      <w:r>
+        <w:rPr>
+          <w:sz w:val="22"/>
+          <w:szCs w:val="22"/>
+        </w:rPr>
+        <w:t xml:space="preserve">University of California, Berkeley — B.S. Computer Science</w:t>
+      </w:r>
+    </w:p>
+    <w:p>
+      <w:pPr>
+        <w:spacing w:after="60"/>
+      </w:pPr>
+      <w:r>
+        <w:rPr>
+          <w:sz w:val="22"/>
+          <w:szCs w:val="22"/>
+        </w:rPr>
+        <w:t xml:space="preserve">Graduated May 2024 | GPA: 3.7 / 4.0 | Dean's List (4 semesters)</w:t>
       </w:r>
     </w:p>
     <w:p>
@@ -502,6 +535,11 @@
       <w:r>
         <w:t xml:space="preserve">CERTIFICATIONS &amp; ACTIVITIES</w:t>
       </w:r>
+    </w:p>
+    <w:p>
+      <w:pPr>
+        <w:spacing w:after="80"/>
+      </w:pPr>
     </w:p>
     <w:p>
       <w:pPr>

</xml_diff>